<commit_message>
Mise à jour du projet
</commit_message>
<xml_diff>
--- a/python-service/outputs/CV_Hichri_Abderrahmen.docx
+++ b/python-service/outputs/CV_Hichri_Abderrahmen.docx
@@ -1612,7 +1612,7 @@
           <w:szCs w:val="24"/>
           <w:lang w:val="en-US"/>
         </w:rPr>
-        <w:t xml:space="preserve">2023 : Baccalauréat Sciences Expérimentales - Lycée local</w:t>
+        <w:t xml:space="preserve">2022-2023 : Baccalauréat Sciences Expérimentales - Lycée local</w:t>
       </w:r>
     </w:p>
     <w:p>
@@ -1673,7 +1673,7 @@
           <w:szCs w:val="24"/>
           <w:lang w:val="en-US"/>
         </w:rPr>
-        <w:t xml:space="preserve">2026 (expected) : Licence en Informatique - Faculté des Sciences de Bizerte, Tunisie</w:t>
+        <w:t xml:space="preserve">2023-2026 : Licence en Informatique - Faculté des Sciences de Bizerte, Tunisie</w:t>
       </w:r>
     </w:p>
     <w:p>
@@ -1847,7 +1847,7 @@
           <w:sz w:val="24"/>
           <w:szCs w:val="24"/>
         </w:rPr>
-        <w:t xml:space="preserve">Français : Fluent</w:t>
+        <w:t xml:space="preserve">Anglais : Fluent</w:t>
       </w:r>
     </w:p>
     <w:p>
@@ -1906,66 +1906,7 @@
           <w:sz w:val="24"/>
           <w:szCs w:val="24"/>
         </w:rPr>
-        <w:t xml:space="preserve">Anglais : Fluent</w:t>
-      </w:r>
-    </w:p>
-    <w:p>
-      <w:pPr>
-        <w:pStyle w:val="Normal"/>
-        <w:tabs>
-          <w:tab w:val="clear" w:pos="708"/>
-          <w:tab w:val="left" w:leader="none" w:pos="1398"/>
-          <w:tab w:val="left" w:leader="none" w:pos="1399"/>
-        </w:tabs>
-        <w:spacing w:before="0" w:after="0" w:line="240" w:lineRule="auto"/>
-        <w:ind w:start="0" w:hanging="0"/>
-        <w:rPr>
-          <w:rFonts w:ascii="Century Gothic" w:hAnsi="Century Gothic"/>
-          <w:color w:val="000000" w:themeColor="text1"/>
-          <w:sz w:val="24"/>
-          <w:szCs w:val="24"/>
-        </w:rPr>
-      </w:pPr>
-      <w:r>
-        <w:rPr>
-          <w:rFonts w:ascii="Century Gothic" w:hAnsi="Century Gothic"/>
-          <w:color w:val="000000" w:themeColor="text1"/>
-          <w:sz w:val="24"/>
-          <w:szCs w:val="24"/>
-        </w:rPr>
-        <w:t xml:space="preserve"/>
-      </w:r>
-    </w:p>
-    <w:p>
-      <w:pPr>
-        <w:pStyle w:val="ListParagraph"/>
-        <w:numPr>
-          <w:ilvl w:val="0"/>
-          <w:numId w:val="1"/>
-        </w:numPr>
-        <w:tabs>
-          <w:tab w:val="clear" w:pos="708"/>
-          <w:tab w:val="left" w:leader="none" w:pos="1398"/>
-          <w:tab w:val="left" w:leader="none" w:pos="1399"/>
-        </w:tabs>
-        <w:spacing w:before="0" w:after="0" w:line="240" w:lineRule="auto"/>
-        <w:ind w:start="1457" w:hanging="720"/>
-        <w:contextualSpacing w:val="false"/>
-        <w:rPr>
-          <w:rFonts w:ascii="Century Gothic" w:hAnsi="Century Gothic"/>
-          <w:color w:val="000000" w:themeColor="text1"/>
-          <w:sz w:val="24"/>
-          <w:szCs w:val="24"/>
-        </w:rPr>
-      </w:pPr>
-      <w:r>
-        <w:rPr>
-          <w:rFonts w:ascii="Century Gothic" w:hAnsi="Century Gothic"/>
-          <w:color w:val="000000" w:themeColor="text1"/>
-          <w:sz w:val="24"/>
-          <w:szCs w:val="24"/>
-        </w:rPr>
-        <w:t xml:space="preserve">Espagnol : Intermediate</w:t>
+        <w:t xml:space="preserve">Français : Intermediate</w:t>
       </w:r>
     </w:p>
     <w:p>

</xml_diff>